<commit_message>
knowleddge 7/3/2026 part 17
</commit_message>
<xml_diff>
--- a/Knowledge/3-Work knowledge/1-Software Engineering/2-General Technologies/9-Databases/5-My Source/2-SQL/7-SQL Commands - Administrative Commands/13-SQL SHOW PROCESSLIST.docx
+++ b/Knowledge/3-Work knowledge/1-Software Engineering/2-General Technologies/9-Databases/5-My Source/2-SQL/7-SQL Commands - Administrative Commands/13-SQL SHOW PROCESSLIST.docx
@@ -14,48 +14,35 @@
     </w:p>
     <w:p>
       <w:pPr>
-        <w:pStyle w:val="Heading3"/>
-        <w:keepNext w:val="0"/>
-        <w:keepLines w:val="0"/>
-        <w:spacing w:before="280"/>
-        <w:rPr>
-          <w:b/>
-          <w:bCs/>
-          <w:color w:val="000000"/>
-          <w:sz w:val="26"/>
-          <w:szCs w:val="26"/>
+        <w:pStyle w:val="Heading2"/>
+        <w:rPr>
+          <w:color w:val="000000"/>
         </w:rPr>
       </w:pPr>
       <w:bookmarkStart w:id="1" w:name="_plebpcbckaqt" w:colFirst="0" w:colLast="0"/>
       <w:bookmarkEnd w:id="1"/>
       <w:r>
         <w:rPr>
-          <w:b/>
-          <w:bCs/>
-          <w:color w:val="000000"/>
-          <w:sz w:val="26"/>
-          <w:szCs w:val="26"/>
-        </w:rPr>
-        <w:t xml:space="preserve">📘 What is </w:t>
-      </w:r>
-      <w:r>
-        <w:rPr>
-          <w:rFonts w:ascii="Roboto Mono" w:eastAsia="Roboto Mono" w:hAnsi="Roboto Mono" w:cs="Roboto Mono"/>
-          <w:b/>
-          <w:bCs/>
-          <w:color w:val="188038"/>
-          <w:sz w:val="26"/>
-          <w:szCs w:val="26"/>
+          <w:rFonts w:ascii="Segoe UI Emoji" w:hAnsi="Segoe UI Emoji" w:cs="Segoe UI Emoji"/>
+          <w:color w:val="000000"/>
+        </w:rPr>
+        <w:t>📘</w:t>
+      </w:r>
+      <w:r>
+        <w:rPr>
+          <w:color w:val="000000"/>
+        </w:rPr>
+        <w:t xml:space="preserve"> What is </w:t>
+      </w:r>
+      <w:r>
+        <w:rPr>
+          <w:rFonts w:eastAsia="Roboto Mono"/>
         </w:rPr>
         <w:t>SHOW PROCESSLIST</w:t>
       </w:r>
       <w:r>
         <w:rPr>
-          <w:b/>
-          <w:bCs/>
-          <w:color w:val="000000"/>
-          <w:sz w:val="26"/>
-          <w:szCs w:val="26"/>
+          <w:color w:val="000000"/>
         </w:rPr>
         <w:t>?</w:t>
       </w:r>
@@ -81,7 +68,27 @@
           <w:sz w:val="18"/>
           <w:highlight w:val="lightGray"/>
         </w:rPr>
-        <w:t xml:space="preserve">: Persons Table -&gt; ID Column: 1, Name_En Column: Motasem Essam] -&gt; </w:t>
+        <w:t xml:space="preserve">: Persons Table -&gt; ID Column: 1, </w:t>
+      </w:r>
+      <w:proofErr w:type="spellStart"/>
+      <w:r>
+        <w:rPr>
+          <w:rFonts w:ascii="Arial" w:eastAsia="Arial" w:hAnsi="Arial" w:cs="Arial"/>
+          <w:color w:val="000000"/>
+          <w:sz w:val="18"/>
+          <w:highlight w:val="lightGray"/>
+        </w:rPr>
+        <w:t>Name_En</w:t>
+      </w:r>
+      <w:proofErr w:type="spellEnd"/>
+      <w:r>
+        <w:rPr>
+          <w:rFonts w:ascii="Arial" w:eastAsia="Arial" w:hAnsi="Arial" w:cs="Arial"/>
+          <w:color w:val="000000"/>
+          <w:sz w:val="18"/>
+          <w:highlight w:val="lightGray"/>
+        </w:rPr>
+        <w:t xml:space="preserve"> Column: Motasem Essam] -&gt; </w:t>
       </w:r>
       <w:r>
         <w:rPr>
@@ -214,30 +221,21 @@
     </w:p>
     <w:p>
       <w:pPr>
-        <w:pStyle w:val="Heading3"/>
-        <w:keepNext w:val="0"/>
-        <w:keepLines w:val="0"/>
-        <w:spacing w:before="280"/>
-        <w:rPr>
-          <w:b/>
-          <w:bCs/>
-          <w:color w:val="000000"/>
-          <w:sz w:val="26"/>
-          <w:szCs w:val="26"/>
-        </w:rPr>
+        <w:pStyle w:val="Heading2"/>
       </w:pPr>
       <w:bookmarkStart w:id="2" w:name="_idqxf7qbh54n" w:colFirst="0" w:colLast="0"/>
       <w:bookmarkEnd w:id="2"/>
       <w:r>
         <w:rPr>
-          <w:rFonts w:ascii="Arial Unicode MS" w:eastAsia="Arial Unicode MS" w:hAnsi="Arial Unicode MS" w:cs="Arial Unicode MS"/>
-          <w:b/>
-          <w:bCs/>
-          <w:color w:val="000000"/>
-          <w:sz w:val="26"/>
-          <w:szCs w:val="26"/>
-        </w:rPr>
-        <w:t>✅ Purpose:</w:t>
+          <w:rFonts w:ascii="Segoe UI Emoji" w:eastAsia="Arial Unicode MS" w:hAnsi="Segoe UI Emoji" w:cs="Segoe UI Emoji"/>
+        </w:rPr>
+        <w:t>✅</w:t>
+      </w:r>
+      <w:r>
+        <w:rPr>
+          <w:rFonts w:eastAsia="Arial Unicode MS"/>
+        </w:rPr>
+        <w:t xml:space="preserve"> Purpose:</w:t>
       </w:r>
     </w:p>
     <w:p>
@@ -268,7 +266,27 @@
           <w:sz w:val="18"/>
           <w:highlight w:val="lightGray"/>
         </w:rPr>
-        <w:t xml:space="preserve">: Persons Table -&gt; ID Column: 1, Name_En Column: Motasem Essam] -&gt; </w:t>
+        <w:t xml:space="preserve">: Persons Table -&gt; ID Column: 1, </w:t>
+      </w:r>
+      <w:proofErr w:type="spellStart"/>
+      <w:r>
+        <w:rPr>
+          <w:rFonts w:ascii="Arial" w:eastAsia="Arial" w:hAnsi="Arial" w:cs="Arial"/>
+          <w:color w:val="000000"/>
+          <w:sz w:val="18"/>
+          <w:highlight w:val="lightGray"/>
+        </w:rPr>
+        <w:t>Name_En</w:t>
+      </w:r>
+      <w:proofErr w:type="spellEnd"/>
+      <w:r>
+        <w:rPr>
+          <w:rFonts w:ascii="Arial" w:eastAsia="Arial" w:hAnsi="Arial" w:cs="Arial"/>
+          <w:color w:val="000000"/>
+          <w:sz w:val="18"/>
+          <w:highlight w:val="lightGray"/>
+        </w:rPr>
+        <w:t xml:space="preserve"> Column: Motasem Essam] -&gt; </w:t>
       </w:r>
       <w:r>
         <w:rPr>
@@ -569,6 +587,7 @@
               <w:rPr>
                 <w:rFonts w:ascii="Roboto Mono" w:eastAsia="Roboto Mono" w:hAnsi="Roboto Mono"/>
               </w:rPr>
+              <w:lastRenderedPageBreak/>
               <w:t>🚫 Find Blocking Sessions</w:t>
             </w:r>
           </w:p>
@@ -667,29 +686,18 @@
     </w:p>
     <w:p>
       <w:pPr>
-        <w:pStyle w:val="Heading3"/>
-        <w:keepNext w:val="0"/>
-        <w:keepLines w:val="0"/>
-        <w:spacing w:before="280"/>
-        <w:rPr>
-          <w:b/>
-          <w:bCs/>
-          <w:color w:val="000000"/>
-          <w:sz w:val="26"/>
-          <w:szCs w:val="26"/>
-        </w:rPr>
+        <w:pStyle w:val="Heading2"/>
       </w:pPr>
       <w:bookmarkStart w:id="3" w:name="_6aimkqucql9e" w:colFirst="0" w:colLast="0"/>
       <w:bookmarkEnd w:id="3"/>
       <w:r>
         <w:rPr>
-          <w:b/>
-          <w:bCs/>
-          <w:color w:val="000000"/>
-          <w:sz w:val="26"/>
-          <w:szCs w:val="26"/>
-        </w:rPr>
-        <w:t>🛠️ Syntax:</w:t>
+          <w:rFonts w:ascii="Segoe UI Emoji" w:hAnsi="Segoe UI Emoji" w:cs="Segoe UI Emoji"/>
+        </w:rPr>
+        <w:t>🛠️</w:t>
+      </w:r>
+      <w:r>
+        <w:t xml:space="preserve"> Syntax:</w:t>
       </w:r>
     </w:p>
     <w:p>
@@ -720,7 +728,27 @@
           <w:sz w:val="18"/>
           <w:highlight w:val="lightGray"/>
         </w:rPr>
-        <w:t xml:space="preserve">: Persons Table -&gt; ID Column: 1, Name_En Column: Motasem Essam] -&gt; </w:t>
+        <w:t xml:space="preserve">: Persons Table -&gt; ID Column: 1, </w:t>
+      </w:r>
+      <w:proofErr w:type="spellStart"/>
+      <w:r>
+        <w:rPr>
+          <w:rFonts w:ascii="Arial" w:eastAsia="Arial" w:hAnsi="Arial" w:cs="Arial"/>
+          <w:color w:val="000000"/>
+          <w:sz w:val="18"/>
+          <w:highlight w:val="lightGray"/>
+        </w:rPr>
+        <w:t>Name_En</w:t>
+      </w:r>
+      <w:proofErr w:type="spellEnd"/>
+      <w:r>
+        <w:rPr>
+          <w:rFonts w:ascii="Arial" w:eastAsia="Arial" w:hAnsi="Arial" w:cs="Arial"/>
+          <w:color w:val="000000"/>
+          <w:sz w:val="18"/>
+          <w:highlight w:val="lightGray"/>
+        </w:rPr>
+        <w:t xml:space="preserve"> Column: Motasem Essam] -&gt; </w:t>
       </w:r>
       <w:r>
         <w:rPr>
@@ -824,29 +852,18 @@
     </w:p>
     <w:p>
       <w:pPr>
-        <w:pStyle w:val="Heading3"/>
-        <w:keepNext w:val="0"/>
-        <w:keepLines w:val="0"/>
-        <w:spacing w:before="280"/>
-        <w:rPr>
-          <w:b/>
-          <w:bCs/>
-          <w:color w:val="000000"/>
-          <w:sz w:val="26"/>
-          <w:szCs w:val="26"/>
-        </w:rPr>
+        <w:pStyle w:val="Heading2"/>
       </w:pPr>
       <w:bookmarkStart w:id="4" w:name="_s2bc2r3nbh40" w:colFirst="0" w:colLast="0"/>
       <w:bookmarkEnd w:id="4"/>
       <w:r>
         <w:rPr>
-          <w:b/>
-          <w:bCs/>
-          <w:color w:val="000000"/>
-          <w:sz w:val="26"/>
-          <w:szCs w:val="26"/>
-        </w:rPr>
-        <w:t>🔐 Full Privileges:</w:t>
+          <w:rFonts w:ascii="Segoe UI Emoji" w:hAnsi="Segoe UI Emoji" w:cs="Segoe UI Emoji"/>
+        </w:rPr>
+        <w:t>🔐</w:t>
+      </w:r>
+      <w:r>
+        <w:t xml:space="preserve"> Full Privileges:</w:t>
       </w:r>
     </w:p>
     <w:p>
@@ -870,7 +887,27 @@
           <w:sz w:val="18"/>
           <w:highlight w:val="lightGray"/>
         </w:rPr>
-        <w:t xml:space="preserve">: Persons Table -&gt; ID Column: 1, Name_En Column: Motasem Essam] -&gt; </w:t>
+        <w:t xml:space="preserve">: Persons Table -&gt; ID Column: 1, </w:t>
+      </w:r>
+      <w:proofErr w:type="spellStart"/>
+      <w:r>
+        <w:rPr>
+          <w:rFonts w:ascii="Arial" w:eastAsia="Arial" w:hAnsi="Arial" w:cs="Arial"/>
+          <w:color w:val="000000"/>
+          <w:sz w:val="18"/>
+          <w:highlight w:val="lightGray"/>
+        </w:rPr>
+        <w:t>Name_En</w:t>
+      </w:r>
+      <w:proofErr w:type="spellEnd"/>
+      <w:r>
+        <w:rPr>
+          <w:rFonts w:ascii="Arial" w:eastAsia="Arial" w:hAnsi="Arial" w:cs="Arial"/>
+          <w:color w:val="000000"/>
+          <w:sz w:val="18"/>
+          <w:highlight w:val="lightGray"/>
+        </w:rPr>
+        <w:t xml:space="preserve"> Column: Motasem Essam] -&gt; </w:t>
       </w:r>
       <w:r>
         <w:rPr>
@@ -1039,29 +1076,19 @@
     </w:p>
     <w:p>
       <w:pPr>
-        <w:pStyle w:val="Heading3"/>
-        <w:keepNext w:val="0"/>
-        <w:keepLines w:val="0"/>
-        <w:spacing w:before="280"/>
-        <w:rPr>
-          <w:b/>
-          <w:bCs/>
-          <w:color w:val="000000"/>
-          <w:sz w:val="26"/>
-          <w:szCs w:val="26"/>
-        </w:rPr>
+        <w:pStyle w:val="Heading2"/>
       </w:pPr>
       <w:bookmarkStart w:id="5" w:name="_89nm0lle6qq8" w:colFirst="0" w:colLast="0"/>
       <w:bookmarkEnd w:id="5"/>
       <w:r>
         <w:rPr>
-          <w:b/>
-          <w:bCs/>
-          <w:color w:val="000000"/>
-          <w:sz w:val="26"/>
-          <w:szCs w:val="26"/>
-        </w:rPr>
-        <w:t>📊 Sample Output:</w:t>
+          <w:rFonts w:ascii="Segoe UI Emoji" w:hAnsi="Segoe UI Emoji" w:cs="Segoe UI Emoji"/>
+        </w:rPr>
+        <w:lastRenderedPageBreak/>
+        <w:t>📊</w:t>
+      </w:r>
+      <w:r>
+        <w:t xml:space="preserve"> Sample Output:</w:t>
       </w:r>
     </w:p>
     <w:p>
@@ -1092,7 +1119,27 @@
           <w:sz w:val="18"/>
           <w:highlight w:val="lightGray"/>
         </w:rPr>
-        <w:t xml:space="preserve">: Persons Table -&gt; ID Column: 1, Name_En Column: Motasem Essam] -&gt; </w:t>
+        <w:t xml:space="preserve">: Persons Table -&gt; ID Column: 1, </w:t>
+      </w:r>
+      <w:proofErr w:type="spellStart"/>
+      <w:r>
+        <w:rPr>
+          <w:rFonts w:ascii="Arial" w:eastAsia="Arial" w:hAnsi="Arial" w:cs="Arial"/>
+          <w:color w:val="000000"/>
+          <w:sz w:val="18"/>
+          <w:highlight w:val="lightGray"/>
+        </w:rPr>
+        <w:t>Name_En</w:t>
+      </w:r>
+      <w:proofErr w:type="spellEnd"/>
+      <w:r>
+        <w:rPr>
+          <w:rFonts w:ascii="Arial" w:eastAsia="Arial" w:hAnsi="Arial" w:cs="Arial"/>
+          <w:color w:val="000000"/>
+          <w:sz w:val="18"/>
+          <w:highlight w:val="lightGray"/>
+        </w:rPr>
+        <w:t xml:space="preserve"> Column: Motasem Essam] -&gt; </w:t>
       </w:r>
       <w:r>
         <w:rPr>
@@ -1313,6 +1360,7 @@
             <w:pPr>
               <w:jc w:val="center"/>
             </w:pPr>
+            <w:proofErr w:type="spellStart"/>
             <w:r>
               <w:rPr>
                 <w:rFonts w:ascii="Roboto Mono" w:eastAsia="Roboto Mono" w:hAnsi="Roboto Mono"/>
@@ -1321,6 +1369,7 @@
               </w:rPr>
               <w:t>db</w:t>
             </w:r>
+            <w:proofErr w:type="spellEnd"/>
           </w:p>
         </w:tc>
         <w:tc>
@@ -1540,12 +1589,14 @@
             </w:tcMar>
           </w:tcPr>
           <w:p>
+            <w:proofErr w:type="spellStart"/>
             <w:r>
               <w:rPr>
                 <w:rFonts w:ascii="Roboto Mono" w:eastAsia="Roboto Mono" w:hAnsi="Roboto Mono"/>
               </w:rPr>
               <w:t>testdb</w:t>
             </w:r>
+            <w:proofErr w:type="spellEnd"/>
           </w:p>
         </w:tc>
         <w:tc>
@@ -1644,8 +1695,16 @@
               <w:rPr>
                 <w:rFonts w:ascii="Roboto Mono" w:eastAsia="Roboto Mono" w:hAnsi="Roboto Mono"/>
               </w:rPr>
-              <w:t>SELECT * FROM large_table</w:t>
-            </w:r>
+              <w:t xml:space="preserve">SELECT * FROM </w:t>
+            </w:r>
+            <w:proofErr w:type="spellStart"/>
+            <w:r>
+              <w:rPr>
+                <w:rFonts w:ascii="Roboto Mono" w:eastAsia="Roboto Mono" w:hAnsi="Roboto Mono"/>
+              </w:rPr>
+              <w:t>large_table</w:t>
+            </w:r>
+            <w:proofErr w:type="spellEnd"/>
           </w:p>
         </w:tc>
       </w:tr>
@@ -1745,12 +1804,14 @@
             </w:tcMar>
           </w:tcPr>
           <w:p>
+            <w:proofErr w:type="spellStart"/>
             <w:r>
               <w:rPr>
                 <w:rFonts w:ascii="Roboto Mono" w:eastAsia="Roboto Mono" w:hAnsi="Roboto Mono"/>
               </w:rPr>
               <w:t>testdb</w:t>
             </w:r>
+            <w:proofErr w:type="spellEnd"/>
           </w:p>
         </w:tc>
         <w:tc>
@@ -2018,12 +2079,14 @@
             </w:tcMar>
           </w:tcPr>
           <w:p>
+            <w:proofErr w:type="spellStart"/>
             <w:r>
               <w:rPr>
                 <w:rFonts w:ascii="Roboto Mono" w:eastAsia="Roboto Mono" w:hAnsi="Roboto Mono"/>
               </w:rPr>
               <w:t>init</w:t>
             </w:r>
+            <w:proofErr w:type="spellEnd"/>
           </w:p>
         </w:tc>
         <w:tc>
@@ -2065,29 +2128,18 @@
     </w:p>
     <w:p>
       <w:pPr>
-        <w:pStyle w:val="Heading3"/>
-        <w:keepNext w:val="0"/>
-        <w:keepLines w:val="0"/>
-        <w:spacing w:before="280"/>
-        <w:rPr>
-          <w:b/>
-          <w:bCs/>
-          <w:color w:val="000000"/>
-          <w:sz w:val="26"/>
-          <w:szCs w:val="26"/>
-        </w:rPr>
+        <w:pStyle w:val="Heading2"/>
       </w:pPr>
       <w:bookmarkStart w:id="6" w:name="_d2lvs1bmqim" w:colFirst="0" w:colLast="0"/>
       <w:bookmarkEnd w:id="6"/>
       <w:r>
         <w:rPr>
-          <w:b/>
-          <w:bCs/>
-          <w:color w:val="000000"/>
-          <w:sz w:val="26"/>
-          <w:szCs w:val="26"/>
-        </w:rPr>
-        <w:t>🔍 Column Breakdown:</w:t>
+          <w:rFonts w:ascii="Segoe UI Emoji" w:hAnsi="Segoe UI Emoji" w:cs="Segoe UI Emoji"/>
+        </w:rPr>
+        <w:t>🔍</w:t>
+      </w:r>
+      <w:r>
+        <w:t xml:space="preserve"> Column Breakdown:</w:t>
       </w:r>
     </w:p>
     <w:p>
@@ -2118,7 +2170,27 @@
           <w:sz w:val="18"/>
           <w:highlight w:val="lightGray"/>
         </w:rPr>
-        <w:t xml:space="preserve">: Persons Table -&gt; ID Column: 1, Name_En Column: Motasem Essam] -&gt; </w:t>
+        <w:t xml:space="preserve">: Persons Table -&gt; ID Column: 1, </w:t>
+      </w:r>
+      <w:proofErr w:type="spellStart"/>
+      <w:r>
+        <w:rPr>
+          <w:rFonts w:ascii="Arial" w:eastAsia="Arial" w:hAnsi="Arial" w:cs="Arial"/>
+          <w:color w:val="000000"/>
+          <w:sz w:val="18"/>
+          <w:highlight w:val="lightGray"/>
+        </w:rPr>
+        <w:t>Name_En</w:t>
+      </w:r>
+      <w:proofErr w:type="spellEnd"/>
+      <w:r>
+        <w:rPr>
+          <w:rFonts w:ascii="Arial" w:eastAsia="Arial" w:hAnsi="Arial" w:cs="Arial"/>
+          <w:color w:val="000000"/>
+          <w:sz w:val="18"/>
+          <w:highlight w:val="lightGray"/>
+        </w:rPr>
+        <w:t xml:space="preserve"> Column: Motasem Essam] -&gt; </w:t>
       </w:r>
       <w:r>
         <w:rPr>
@@ -2164,6 +2236,7 @@
         <w:rPr>
           <w:noProof/>
         </w:rPr>
+        <w:lastRenderedPageBreak/>
         <w:drawing>
           <wp:inline distT="114300" distB="114300" distL="114300" distR="114300" wp14:anchorId="572B03B2" wp14:editId="2839A00E">
             <wp:extent cx="5943600" cy="3124200"/>
@@ -2473,6 +2546,7 @@
             </w:tcMar>
           </w:tcPr>
           <w:p>
+            <w:proofErr w:type="spellStart"/>
             <w:r>
               <w:rPr>
                 <w:rFonts w:ascii="Roboto Mono" w:eastAsia="Roboto Mono" w:hAnsi="Roboto Mono" w:cs="Roboto Mono"/>
@@ -2480,6 +2554,7 @@
               </w:rPr>
               <w:t>db</w:t>
             </w:r>
+            <w:proofErr w:type="spellEnd"/>
           </w:p>
         </w:tc>
         <w:tc>
@@ -2702,6 +2777,7 @@
                 <w:rFonts w:ascii="Roboto Mono" w:eastAsia="Roboto Mono" w:hAnsi="Roboto Mono" w:cs="Roboto Mono"/>
                 <w:color w:val="188038"/>
               </w:rPr>
+              <w:lastRenderedPageBreak/>
               <w:t>Info</w:t>
             </w:r>
           </w:p>
@@ -2758,29 +2834,18 @@
     </w:p>
     <w:p>
       <w:pPr>
-        <w:pStyle w:val="Heading3"/>
-        <w:keepNext w:val="0"/>
-        <w:keepLines w:val="0"/>
-        <w:spacing w:before="280"/>
-        <w:rPr>
-          <w:b/>
-          <w:bCs/>
-          <w:color w:val="000000"/>
-          <w:sz w:val="26"/>
-          <w:szCs w:val="26"/>
-        </w:rPr>
+        <w:pStyle w:val="Heading2"/>
       </w:pPr>
       <w:bookmarkStart w:id="7" w:name="_6vqpbn24sdhf" w:colFirst="0" w:colLast="0"/>
       <w:bookmarkEnd w:id="7"/>
       <w:r>
         <w:rPr>
-          <w:b/>
-          <w:bCs/>
-          <w:color w:val="000000"/>
-          <w:sz w:val="26"/>
-          <w:szCs w:val="26"/>
-        </w:rPr>
-        <w:t>🔎 Tip: Kill a Stuck Thread</w:t>
+          <w:rFonts w:ascii="Segoe UI Emoji" w:hAnsi="Segoe UI Emoji" w:cs="Segoe UI Emoji"/>
+        </w:rPr>
+        <w:t>🔎</w:t>
+      </w:r>
+      <w:r>
+        <w:t xml:space="preserve"> Tip: Kill a Stuck Thread</w:t>
       </w:r>
     </w:p>
     <w:p>
@@ -2804,7 +2869,27 @@
           <w:sz w:val="18"/>
           <w:highlight w:val="lightGray"/>
         </w:rPr>
-        <w:t xml:space="preserve">: Persons Table -&gt; ID Column: 1, Name_En Column: Motasem Essam] -&gt; </w:t>
+        <w:t xml:space="preserve">: Persons Table -&gt; ID Column: 1, </w:t>
+      </w:r>
+      <w:proofErr w:type="spellStart"/>
+      <w:r>
+        <w:rPr>
+          <w:rFonts w:ascii="Arial" w:eastAsia="Arial" w:hAnsi="Arial" w:cs="Arial"/>
+          <w:color w:val="000000"/>
+          <w:sz w:val="18"/>
+          <w:highlight w:val="lightGray"/>
+        </w:rPr>
+        <w:t>Name_En</w:t>
+      </w:r>
+      <w:proofErr w:type="spellEnd"/>
+      <w:r>
+        <w:rPr>
+          <w:rFonts w:ascii="Arial" w:eastAsia="Arial" w:hAnsi="Arial" w:cs="Arial"/>
+          <w:color w:val="000000"/>
+          <w:sz w:val="18"/>
+          <w:highlight w:val="lightGray"/>
+        </w:rPr>
+        <w:t xml:space="preserve"> Column: Motasem Essam] -&gt; </w:t>
       </w:r>
       <w:r>
         <w:rPr>
@@ -2993,8 +3078,20 @@
           <w:sz w:val="18"/>
           <w:highlight w:val="lightGray"/>
         </w:rPr>
-        <w:t># Source: ScreenShot</w:t>
-      </w:r>
+        <w:t xml:space="preserve"># Source: </w:t>
+      </w:r>
+      <w:proofErr w:type="spellStart"/>
+      <w:r>
+        <w:rPr>
+          <w:rFonts w:ascii="Arial" w:eastAsia="Arial" w:hAnsi="Arial" w:cs="Arial"/>
+          <w:b/>
+          <w:color w:val="000000"/>
+          <w:sz w:val="18"/>
+          <w:highlight w:val="lightGray"/>
+        </w:rPr>
+        <w:t>ScreenShot</w:t>
+      </w:r>
+      <w:proofErr w:type="spellEnd"/>
       <w:r>
         <w:rPr>
           <w:rFonts w:ascii="Arial" w:eastAsia="Arial" w:hAnsi="Arial" w:cs="Arial"/>
@@ -3040,7 +3137,27 @@
           <w:sz w:val="18"/>
           <w:highlight w:val="lightGray"/>
         </w:rPr>
-        <w:t xml:space="preserve"> [Persons Table -&gt; ID Column: 1, Name_En Column: Motasem Essam] -&gt; </w:t>
+        <w:t xml:space="preserve"> [Persons Table -&gt; ID Column: 1, </w:t>
+      </w:r>
+      <w:proofErr w:type="spellStart"/>
+      <w:r>
+        <w:rPr>
+          <w:rFonts w:ascii="Arial" w:eastAsia="Arial" w:hAnsi="Arial" w:cs="Arial"/>
+          <w:color w:val="000000"/>
+          <w:sz w:val="18"/>
+          <w:highlight w:val="lightGray"/>
+        </w:rPr>
+        <w:t>Name_En</w:t>
+      </w:r>
+      <w:proofErr w:type="spellEnd"/>
+      <w:r>
+        <w:rPr>
+          <w:rFonts w:ascii="Arial" w:eastAsia="Arial" w:hAnsi="Arial" w:cs="Arial"/>
+          <w:color w:val="000000"/>
+          <w:sz w:val="18"/>
+          <w:highlight w:val="lightGray"/>
+        </w:rPr>
+        <w:t xml:space="preserve"> Column: Motasem Essam] -&gt; </w:t>
       </w:r>
       <w:r>
         <w:rPr>
@@ -3059,7 +3176,27 @@
           <w:sz w:val="18"/>
           <w:highlight w:val="lightGray"/>
         </w:rPr>
-        <w:t xml:space="preserve"> [Automation Table -&gt; ID Column: 16, Name_En Column: Screen Capture] -&gt; </w:t>
+        <w:t xml:space="preserve"> [Automation Table -&gt; ID Column: 16, </w:t>
+      </w:r>
+      <w:proofErr w:type="spellStart"/>
+      <w:r>
+        <w:rPr>
+          <w:rFonts w:ascii="Arial" w:eastAsia="Arial" w:hAnsi="Arial" w:cs="Arial"/>
+          <w:color w:val="000000"/>
+          <w:sz w:val="18"/>
+          <w:highlight w:val="lightGray"/>
+        </w:rPr>
+        <w:t>Name_En</w:t>
+      </w:r>
+      <w:proofErr w:type="spellEnd"/>
+      <w:r>
+        <w:rPr>
+          <w:rFonts w:ascii="Arial" w:eastAsia="Arial" w:hAnsi="Arial" w:cs="Arial"/>
+          <w:color w:val="000000"/>
+          <w:sz w:val="18"/>
+          <w:highlight w:val="lightGray"/>
+        </w:rPr>
+        <w:t xml:space="preserve"> Column: Screen Capture] -&gt; </w:t>
       </w:r>
       <w:r>
         <w:rPr>
@@ -3078,7 +3215,27 @@
           <w:sz w:val="18"/>
           <w:highlight w:val="lightGray"/>
         </w:rPr>
-        <w:t xml:space="preserve">[Operating System: Wampserver64 -&gt; phpmyadmin] </w:t>
+        <w:t xml:space="preserve">[Operating System: Wampserver64 -&gt; </w:t>
+      </w:r>
+      <w:proofErr w:type="spellStart"/>
+      <w:r>
+        <w:rPr>
+          <w:rFonts w:ascii="Arial" w:eastAsia="Arial" w:hAnsi="Arial" w:cs="Arial"/>
+          <w:color w:val="000000"/>
+          <w:sz w:val="18"/>
+          <w:highlight w:val="lightGray"/>
+        </w:rPr>
+        <w:t>phpmyadmin</w:t>
+      </w:r>
+      <w:proofErr w:type="spellEnd"/>
+      <w:r>
+        <w:rPr>
+          <w:rFonts w:ascii="Arial" w:eastAsia="Arial" w:hAnsi="Arial" w:cs="Arial"/>
+          <w:color w:val="000000"/>
+          <w:sz w:val="18"/>
+          <w:highlight w:val="lightGray"/>
+        </w:rPr>
+        <w:t xml:space="preserve">] </w:t>
       </w:r>
       <w:r>
         <w:rPr>
@@ -3105,6 +3262,7 @@
         <w:rPr>
           <w:noProof/>
         </w:rPr>
+        <w:lastRenderedPageBreak/>
         <w:drawing>
           <wp:inline distT="114300" distB="114300" distL="114300" distR="114300" wp14:anchorId="2E40BA73" wp14:editId="043D94D0">
             <wp:extent cx="5943600" cy="3530600"/>
@@ -3200,6 +3358,7 @@
       <w:bookmarkStart w:id="10" w:name="_l5c3eh5obqjz" w:colFirst="0" w:colLast="0"/>
       <w:bookmarkEnd w:id="10"/>
       <w:r>
+        <w:lastRenderedPageBreak/>
         <w:t>basic command</w:t>
       </w:r>
     </w:p>
@@ -3222,8 +3381,20 @@
           <w:sz w:val="18"/>
           <w:highlight w:val="lightGray"/>
         </w:rPr>
-        <w:t># Source: ScreenShot</w:t>
-      </w:r>
+        <w:t xml:space="preserve"># Source: </w:t>
+      </w:r>
+      <w:proofErr w:type="spellStart"/>
+      <w:r>
+        <w:rPr>
+          <w:rFonts w:ascii="Arial" w:eastAsia="Arial" w:hAnsi="Arial" w:cs="Arial"/>
+          <w:b/>
+          <w:color w:val="000000"/>
+          <w:sz w:val="18"/>
+          <w:highlight w:val="lightGray"/>
+        </w:rPr>
+        <w:t>ScreenShot</w:t>
+      </w:r>
+      <w:proofErr w:type="spellEnd"/>
       <w:r>
         <w:rPr>
           <w:rFonts w:ascii="Arial" w:eastAsia="Arial" w:hAnsi="Arial" w:cs="Arial"/>
@@ -3269,7 +3440,27 @@
           <w:sz w:val="18"/>
           <w:highlight w:val="lightGray"/>
         </w:rPr>
-        <w:t xml:space="preserve"> [Persons Table -&gt; ID Column: 1, Name_En Column: Motasem Essam] -&gt; </w:t>
+        <w:t xml:space="preserve"> [Persons Table -&gt; ID Column: 1, </w:t>
+      </w:r>
+      <w:proofErr w:type="spellStart"/>
+      <w:r>
+        <w:rPr>
+          <w:rFonts w:ascii="Arial" w:eastAsia="Arial" w:hAnsi="Arial" w:cs="Arial"/>
+          <w:color w:val="000000"/>
+          <w:sz w:val="18"/>
+          <w:highlight w:val="lightGray"/>
+        </w:rPr>
+        <w:t>Name_En</w:t>
+      </w:r>
+      <w:proofErr w:type="spellEnd"/>
+      <w:r>
+        <w:rPr>
+          <w:rFonts w:ascii="Arial" w:eastAsia="Arial" w:hAnsi="Arial" w:cs="Arial"/>
+          <w:color w:val="000000"/>
+          <w:sz w:val="18"/>
+          <w:highlight w:val="lightGray"/>
+        </w:rPr>
+        <w:t xml:space="preserve"> Column: Motasem Essam] -&gt; </w:t>
       </w:r>
       <w:r>
         <w:rPr>
@@ -3288,7 +3479,27 @@
           <w:sz w:val="18"/>
           <w:highlight w:val="lightGray"/>
         </w:rPr>
-        <w:t xml:space="preserve"> [Automation Table -&gt; ID Column: 16, Name_En Column: Screen Capture] -&gt; </w:t>
+        <w:t xml:space="preserve"> [Automation Table -&gt; ID Column: 16, </w:t>
+      </w:r>
+      <w:proofErr w:type="spellStart"/>
+      <w:r>
+        <w:rPr>
+          <w:rFonts w:ascii="Arial" w:eastAsia="Arial" w:hAnsi="Arial" w:cs="Arial"/>
+          <w:color w:val="000000"/>
+          <w:sz w:val="18"/>
+          <w:highlight w:val="lightGray"/>
+        </w:rPr>
+        <w:t>Name_En</w:t>
+      </w:r>
+      <w:proofErr w:type="spellEnd"/>
+      <w:r>
+        <w:rPr>
+          <w:rFonts w:ascii="Arial" w:eastAsia="Arial" w:hAnsi="Arial" w:cs="Arial"/>
+          <w:color w:val="000000"/>
+          <w:sz w:val="18"/>
+          <w:highlight w:val="lightGray"/>
+        </w:rPr>
+        <w:t xml:space="preserve"> Column: Screen Capture] -&gt; </w:t>
       </w:r>
       <w:r>
         <w:rPr>
@@ -3307,7 +3518,27 @@
           <w:sz w:val="18"/>
           <w:highlight w:val="lightGray"/>
         </w:rPr>
-        <w:t xml:space="preserve">[Operating System: Wampserver64 -&gt; phpmyadmin] </w:t>
+        <w:t xml:space="preserve">[Operating System: Wampserver64 -&gt; </w:t>
+      </w:r>
+      <w:proofErr w:type="spellStart"/>
+      <w:r>
+        <w:rPr>
+          <w:rFonts w:ascii="Arial" w:eastAsia="Arial" w:hAnsi="Arial" w:cs="Arial"/>
+          <w:color w:val="000000"/>
+          <w:sz w:val="18"/>
+          <w:highlight w:val="lightGray"/>
+        </w:rPr>
+        <w:t>phpmyadmin</w:t>
+      </w:r>
+      <w:proofErr w:type="spellEnd"/>
+      <w:r>
+        <w:rPr>
+          <w:rFonts w:ascii="Arial" w:eastAsia="Arial" w:hAnsi="Arial" w:cs="Arial"/>
+          <w:color w:val="000000"/>
+          <w:sz w:val="18"/>
+          <w:highlight w:val="lightGray"/>
+        </w:rPr>
+        <w:t xml:space="preserve">] </w:t>
       </w:r>
       <w:r>
         <w:rPr>

</xml_diff>